<commit_message>
Update Task 5, 6, 7, 8
</commit_message>
<xml_diff>
--- a/Task_06/DucNVFX14814_CN2_Screen_Design.docx
+++ b/Task_06/DucNVFX14814_CN2_Screen_Design.docx
@@ -131,7 +131,84 @@
         <w:rPr>
           <w:rFonts w:asciiTheme="majorHAnsi" w:hAnsiTheme="majorHAnsi" w:cstheme="majorHAnsi"/>
         </w:rPr>
-        <w:t xml:space="preserve">Tài liệu này mô tả thiết kế giao diện cho Chức năng 2 (CN2) - Quản lý vé dò của dự án Dò vé số, dành cho ADMIN. Giao diện được xây dựng bằng Bootstrap CSS Framework, dữ liệu kết quả xổ số được lấy tự động từ nguồn </w:t>
+        <w:t>Tài liệu này mô tả thiết kế giao diện cho Chức năng 2 (CN2) - Quản lý vé dò của dự án Dò vé số, dành cho ADMIN</w:t>
+      </w:r>
+      <w:r>
+        <w:rPr>
+          <w:rFonts w:asciiTheme="majorHAnsi" w:hAnsiTheme="majorHAnsi" w:cstheme="majorHAnsi"/>
+          <w:lang w:val="en-US"/>
+        </w:rPr>
+        <w:t xml:space="preserve">, </w:t>
+      </w:r>
+      <w:proofErr w:type="spellStart"/>
+      <w:r>
+        <w:rPr>
+          <w:rFonts w:asciiTheme="majorHAnsi" w:hAnsiTheme="majorHAnsi" w:cstheme="majorHAnsi"/>
+          <w:lang w:val="en-US"/>
+        </w:rPr>
+        <w:t>không</w:t>
+      </w:r>
+      <w:proofErr w:type="spellEnd"/>
+      <w:r>
+        <w:rPr>
+          <w:rFonts w:asciiTheme="majorHAnsi" w:hAnsiTheme="majorHAnsi" w:cstheme="majorHAnsi"/>
+          <w:lang w:val="en-US"/>
+        </w:rPr>
+        <w:t xml:space="preserve"> </w:t>
+      </w:r>
+      <w:proofErr w:type="spellStart"/>
+      <w:r>
+        <w:rPr>
+          <w:rFonts w:asciiTheme="majorHAnsi" w:hAnsiTheme="majorHAnsi" w:cstheme="majorHAnsi"/>
+          <w:lang w:val="en-US"/>
+        </w:rPr>
+        <w:t>hỗ</w:t>
+      </w:r>
+      <w:proofErr w:type="spellEnd"/>
+      <w:r>
+        <w:rPr>
+          <w:rFonts w:asciiTheme="majorHAnsi" w:hAnsiTheme="majorHAnsi" w:cstheme="majorHAnsi"/>
+          <w:lang w:val="en-US"/>
+        </w:rPr>
+        <w:t xml:space="preserve"> </w:t>
+      </w:r>
+      <w:proofErr w:type="spellStart"/>
+      <w:r>
+        <w:rPr>
+          <w:rFonts w:asciiTheme="majorHAnsi" w:hAnsiTheme="majorHAnsi" w:cstheme="majorHAnsi"/>
+          <w:lang w:val="en-US"/>
+        </w:rPr>
+        <w:t>trợ</w:t>
+      </w:r>
+      <w:proofErr w:type="spellEnd"/>
+      <w:r>
+        <w:rPr>
+          <w:rFonts w:asciiTheme="majorHAnsi" w:hAnsiTheme="majorHAnsi" w:cstheme="majorHAnsi"/>
+          <w:lang w:val="en-US"/>
+        </w:rPr>
+        <w:t xml:space="preserve"> </w:t>
+      </w:r>
+      <w:proofErr w:type="spellStart"/>
+      <w:r>
+        <w:rPr>
+          <w:rFonts w:asciiTheme="majorHAnsi" w:hAnsiTheme="majorHAnsi" w:cstheme="majorHAnsi"/>
+          <w:lang w:val="en-US"/>
+        </w:rPr>
+        <w:t>cho</w:t>
+      </w:r>
+      <w:proofErr w:type="spellEnd"/>
+      <w:r>
+        <w:rPr>
+          <w:rFonts w:asciiTheme="majorHAnsi" w:hAnsiTheme="majorHAnsi" w:cstheme="majorHAnsi"/>
+          <w:lang w:val="en-US"/>
+        </w:rPr>
+        <w:t xml:space="preserve"> NO_USER/USER(YC2/YC3)</w:t>
+      </w:r>
+      <w:r>
+        <w:rPr>
+          <w:rFonts w:asciiTheme="majorHAnsi" w:hAnsiTheme="majorHAnsi" w:cstheme="majorHAnsi"/>
+        </w:rPr>
+        <w:t xml:space="preserve">. Giao diện được xây dựng bằng Bootstrap CSS Framework, dữ liệu kết quả xổ số được lấy tự động từ nguồn </w:t>
       </w:r>
       <w:proofErr w:type="spellStart"/>
       <w:r>
@@ -230,6 +307,67 @@
         </w:rPr>
         <w:t>ADMIN: Danh sách vé dò ⇄ Thêm vé dò mới / Thêm vé dò hàng loạt (chỉ ADMIN chính) ⇄ Chi tiết vé dò (Publish)</w:t>
       </w:r>
+    </w:p>
+    <w:p>
+      <w:pPr>
+        <w:pStyle w:val="ListParagraph"/>
+        <w:numPr>
+          <w:ilvl w:val="0"/>
+          <w:numId w:val="2"/>
+        </w:numPr>
+        <w:spacing w:after="100"/>
+        <w:rPr>
+          <w:rFonts w:asciiTheme="majorHAnsi" w:hAnsiTheme="majorHAnsi" w:cstheme="majorHAnsi"/>
+        </w:rPr>
+      </w:pPr>
+      <w:r>
+        <w:rPr>
+          <w:rFonts w:asciiTheme="majorHAnsi" w:hAnsiTheme="majorHAnsi" w:cstheme="majorHAnsi"/>
+          <w:lang w:val="en-US"/>
+        </w:rPr>
+        <w:t xml:space="preserve">NO_USER/USER: </w:t>
+      </w:r>
+      <w:proofErr w:type="spellStart"/>
+      <w:r>
+        <w:rPr>
+          <w:rFonts w:asciiTheme="majorHAnsi" w:hAnsiTheme="majorHAnsi" w:cstheme="majorHAnsi"/>
+          <w:lang w:val="en-US"/>
+        </w:rPr>
+        <w:t>Không</w:t>
+      </w:r>
+      <w:proofErr w:type="spellEnd"/>
+      <w:r>
+        <w:rPr>
+          <w:rFonts w:asciiTheme="majorHAnsi" w:hAnsiTheme="majorHAnsi" w:cstheme="majorHAnsi"/>
+          <w:lang w:val="en-US"/>
+        </w:rPr>
+        <w:t xml:space="preserve"> </w:t>
+      </w:r>
+      <w:proofErr w:type="spellStart"/>
+      <w:r>
+        <w:rPr>
+          <w:rFonts w:asciiTheme="majorHAnsi" w:hAnsiTheme="majorHAnsi" w:cstheme="majorHAnsi"/>
+          <w:lang w:val="en-US"/>
+        </w:rPr>
+        <w:t>hỗ</w:t>
+      </w:r>
+      <w:proofErr w:type="spellEnd"/>
+      <w:r>
+        <w:rPr>
+          <w:rFonts w:asciiTheme="majorHAnsi" w:hAnsiTheme="majorHAnsi" w:cstheme="majorHAnsi"/>
+          <w:lang w:val="en-US"/>
+        </w:rPr>
+        <w:t xml:space="preserve"> </w:t>
+      </w:r>
+      <w:proofErr w:type="spellStart"/>
+      <w:r>
+        <w:rPr>
+          <w:rFonts w:asciiTheme="majorHAnsi" w:hAnsiTheme="majorHAnsi" w:cstheme="majorHAnsi"/>
+          <w:lang w:val="en-US"/>
+        </w:rPr>
+        <w:t>trợ</w:t>
+      </w:r>
+      <w:proofErr w:type="spellEnd"/>
     </w:p>
     <w:p>
       <w:pPr>
@@ -4674,6 +4812,75 @@
           <w:lang w:val="en-US" w:eastAsia="ja-JP"/>
         </w:rPr>
         <w:t>Một số mô tả khác</w:t>
+      </w:r>
+    </w:p>
+    <w:p>
+      <w:pPr>
+        <w:pStyle w:val="ListParagraph"/>
+        <w:numPr>
+          <w:ilvl w:val="0"/>
+          <w:numId w:val="5"/>
+        </w:numPr>
+        <w:rPr>
+          <w:rFonts w:eastAsia="MS Mincho"/>
+          <w:noProof/>
+          <w:snapToGrid w:val="0"/>
+          <w:lang w:val="en-US" w:eastAsia="ja-JP"/>
+        </w:rPr>
+      </w:pPr>
+      <w:r>
+        <w:rPr>
+          <w:rFonts w:eastAsia="MS Mincho"/>
+          <w:noProof/>
+          <w:snapToGrid w:val="0"/>
+          <w:lang w:val="en-US" w:eastAsia="ja-JP"/>
+        </w:rPr>
+        <w:t>Chức năng "Thêm vé dò" phụ thuộc nguồn Minh Ngọc (cần mạng, dễ vỡ nếu trang nguồn đổi cấu trúc HTML)</w:t>
+      </w:r>
+      <w:r>
+        <w:rPr>
+          <w:rFonts w:eastAsia="MS Mincho"/>
+          <w:noProof/>
+          <w:snapToGrid w:val="0"/>
+          <w:lang w:val="en-US" w:eastAsia="ja-JP"/>
+        </w:rPr>
+        <w:t xml:space="preserve">, cần có </w:t>
+      </w:r>
+      <w:r>
+        <w:rPr>
+          <w:rFonts w:eastAsia="MS Mincho"/>
+          <w:noProof/>
+          <w:snapToGrid w:val="0"/>
+          <w:lang w:val="en-US" w:eastAsia="ja-JP"/>
+        </w:rPr>
+        <w:t>phương án dự phòng/nhập tay</w:t>
+      </w:r>
+      <w:r>
+        <w:rPr>
+          <w:rFonts w:eastAsia="MS Mincho"/>
+          <w:noProof/>
+          <w:snapToGrid w:val="0"/>
+          <w:lang w:val="en-US" w:eastAsia="ja-JP"/>
+        </w:rPr>
+        <w:t xml:space="preserve"> </w:t>
+      </w:r>
+      <w:r>
+        <w:rPr>
+          <w:rFonts w:eastAsia="MS Mincho"/>
+          <w:noProof/>
+          <w:snapToGrid w:val="0"/>
+          <w:lang w:val="en-US" w:eastAsia="ja-JP"/>
+        </w:rPr>
+        <w:sym w:font="Symbol" w:char="F0AE"/>
+      </w:r>
+      <w:r>
+        <w:rPr>
+          <w:rFonts w:eastAsia="MS Mincho"/>
+          <w:noProof/>
+          <w:snapToGrid w:val="0"/>
+          <w:lang w:val="en-US" w:eastAsia="ja-JP"/>
+        </w:rPr>
+        <w:t xml:space="preserve"> Sẽ phát triển trong các lần nâng cấp tiếp theo</w:t>
       </w:r>
     </w:p>
     <w:sectPr>
@@ -4887,6 +5094,119 @@
     </w:lvl>
   </w:abstractNum>
   <w:abstractNum w:abstractNumId="1" w15:restartNumberingAfterBreak="0">
+    <w:nsid w:val="245474BF"/>
+    <w:multiLevelType w:val="hybridMultilevel"/>
+    <w:tmpl w:val="19A89AFA"/>
+    <w:lvl w:ilvl="0" w:tplc="042A000B">
+      <w:start w:val="1"/>
+      <w:numFmt w:val="bullet"/>
+      <w:lvlText w:val=""/>
+      <w:lvlJc w:val="left"/>
+      <w:pPr>
+        <w:ind w:left="720" w:hanging="360"/>
+      </w:pPr>
+      <w:rPr>
+        <w:rFonts w:ascii="Wingdings" w:hAnsi="Wingdings" w:hint="default"/>
+      </w:rPr>
+    </w:lvl>
+    <w:lvl w:ilvl="1" w:tplc="042A0003" w:tentative="1">
+      <w:start w:val="1"/>
+      <w:numFmt w:val="bullet"/>
+      <w:lvlText w:val="o"/>
+      <w:lvlJc w:val="left"/>
+      <w:pPr>
+        <w:ind w:left="1440" w:hanging="360"/>
+      </w:pPr>
+      <w:rPr>
+        <w:rFonts w:ascii="Courier New" w:hAnsi="Courier New" w:cs="Courier New" w:hint="default"/>
+      </w:rPr>
+    </w:lvl>
+    <w:lvl w:ilvl="2" w:tplc="042A0005" w:tentative="1">
+      <w:start w:val="1"/>
+      <w:numFmt w:val="bullet"/>
+      <w:lvlText w:val=""/>
+      <w:lvlJc w:val="left"/>
+      <w:pPr>
+        <w:ind w:left="2160" w:hanging="360"/>
+      </w:pPr>
+      <w:rPr>
+        <w:rFonts w:ascii="Wingdings" w:hAnsi="Wingdings" w:hint="default"/>
+      </w:rPr>
+    </w:lvl>
+    <w:lvl w:ilvl="3" w:tplc="042A0001" w:tentative="1">
+      <w:start w:val="1"/>
+      <w:numFmt w:val="bullet"/>
+      <w:lvlText w:val=""/>
+      <w:lvlJc w:val="left"/>
+      <w:pPr>
+        <w:ind w:left="2880" w:hanging="360"/>
+      </w:pPr>
+      <w:rPr>
+        <w:rFonts w:ascii="Symbol" w:hAnsi="Symbol" w:hint="default"/>
+      </w:rPr>
+    </w:lvl>
+    <w:lvl w:ilvl="4" w:tplc="042A0003" w:tentative="1">
+      <w:start w:val="1"/>
+      <w:numFmt w:val="bullet"/>
+      <w:lvlText w:val="o"/>
+      <w:lvlJc w:val="left"/>
+      <w:pPr>
+        <w:ind w:left="3600" w:hanging="360"/>
+      </w:pPr>
+      <w:rPr>
+        <w:rFonts w:ascii="Courier New" w:hAnsi="Courier New" w:cs="Courier New" w:hint="default"/>
+      </w:rPr>
+    </w:lvl>
+    <w:lvl w:ilvl="5" w:tplc="042A0005" w:tentative="1">
+      <w:start w:val="1"/>
+      <w:numFmt w:val="bullet"/>
+      <w:lvlText w:val=""/>
+      <w:lvlJc w:val="left"/>
+      <w:pPr>
+        <w:ind w:left="4320" w:hanging="360"/>
+      </w:pPr>
+      <w:rPr>
+        <w:rFonts w:ascii="Wingdings" w:hAnsi="Wingdings" w:hint="default"/>
+      </w:rPr>
+    </w:lvl>
+    <w:lvl w:ilvl="6" w:tplc="042A0001" w:tentative="1">
+      <w:start w:val="1"/>
+      <w:numFmt w:val="bullet"/>
+      <w:lvlText w:val=""/>
+      <w:lvlJc w:val="left"/>
+      <w:pPr>
+        <w:ind w:left="5040" w:hanging="360"/>
+      </w:pPr>
+      <w:rPr>
+        <w:rFonts w:ascii="Symbol" w:hAnsi="Symbol" w:hint="default"/>
+      </w:rPr>
+    </w:lvl>
+    <w:lvl w:ilvl="7" w:tplc="042A0003" w:tentative="1">
+      <w:start w:val="1"/>
+      <w:numFmt w:val="bullet"/>
+      <w:lvlText w:val="o"/>
+      <w:lvlJc w:val="left"/>
+      <w:pPr>
+        <w:ind w:left="5760" w:hanging="360"/>
+      </w:pPr>
+      <w:rPr>
+        <w:rFonts w:ascii="Courier New" w:hAnsi="Courier New" w:cs="Courier New" w:hint="default"/>
+      </w:rPr>
+    </w:lvl>
+    <w:lvl w:ilvl="8" w:tplc="042A0005" w:tentative="1">
+      <w:start w:val="1"/>
+      <w:numFmt w:val="bullet"/>
+      <w:lvlText w:val=""/>
+      <w:lvlJc w:val="left"/>
+      <w:pPr>
+        <w:ind w:left="6480" w:hanging="360"/>
+      </w:pPr>
+      <w:rPr>
+        <w:rFonts w:ascii="Wingdings" w:hAnsi="Wingdings" w:hint="default"/>
+      </w:rPr>
+    </w:lvl>
+  </w:abstractNum>
+  <w:abstractNum w:abstractNumId="2" w15:restartNumberingAfterBreak="0">
     <w:nsid w:val="2C9F184B"/>
     <w:multiLevelType w:val="hybridMultilevel"/>
     <w:tmpl w:val="6E10B6DC"/>
@@ -4972,7 +5292,7 @@
       </w:pPr>
     </w:lvl>
   </w:abstractNum>
-  <w:abstractNum w:abstractNumId="2" w15:restartNumberingAfterBreak="0">
+  <w:abstractNum w:abstractNumId="3" w15:restartNumberingAfterBreak="0">
     <w:nsid w:val="47F82BF4"/>
     <w:multiLevelType w:val="hybridMultilevel"/>
     <w:tmpl w:val="EA2AF41E"/>
@@ -5085,7 +5405,7 @@
       </w:rPr>
     </w:lvl>
   </w:abstractNum>
-  <w:abstractNum w:abstractNumId="3" w15:restartNumberingAfterBreak="0">
+  <w:abstractNum w:abstractNumId="4" w15:restartNumberingAfterBreak="0">
     <w:nsid w:val="481501A8"/>
     <w:multiLevelType w:val="hybridMultilevel"/>
     <w:tmpl w:val="8C5C30A6"/>
@@ -5199,19 +5519,22 @@
     </w:lvl>
   </w:abstractNum>
   <w:num w:numId="1" w16cid:durableId="533884682">
-    <w:abstractNumId w:val="1"/>
+    <w:abstractNumId w:val="2"/>
     <w:lvlOverride w:ilvl="0">
       <w:startOverride w:val="1"/>
     </w:lvlOverride>
   </w:num>
   <w:num w:numId="2" w16cid:durableId="816385523">
-    <w:abstractNumId w:val="2"/>
+    <w:abstractNumId w:val="3"/>
   </w:num>
   <w:num w:numId="3" w16cid:durableId="1929607114">
-    <w:abstractNumId w:val="3"/>
+    <w:abstractNumId w:val="4"/>
   </w:num>
   <w:num w:numId="4" w16cid:durableId="135074704">
     <w:abstractNumId w:val="0"/>
+  </w:num>
+  <w:num w:numId="5" w16cid:durableId="1727296473">
+    <w:abstractNumId w:val="1"/>
   </w:num>
 </w:numbering>
 </file>

</xml_diff>